<commit_message>
Add silent terminal and pointer demonstration
</commit_message>
<xml_diff>
--- a/docs/JAS-OS-Technical-Report.docx
+++ b/docs/JAS-OS-Technical-Report.docx
@@ -3108,7 +3108,7 @@
                 <w:color w:val="1F2937"/>
                 <w:sz w:val="17"/>
               </w:rPr>
-              <w:t>92,640 bytes; build completed with no compiler warnings</w:t>
+              <w:t>93,408 bytes; build completed with no compiler warnings</w:t>
             </w:r>
           </w:p>
         </w:tc>
@@ -3198,7 +3198,7 @@
                 <w:color w:val="1F2937"/>
                 <w:sz w:val="17"/>
               </w:rPr>
-              <w:t>7C6198C6FF5BF41AEF946BB619F5B148DC93A03673FBCEC630818C2371AC8C3E</w:t>
+              <w:t>CC89E64B14337AFAE5DAEE51B2C7A059C92BE3D808551495B41C981EAF17A2C1</w:t>
             </w:r>
           </w:p>
         </w:tc>
@@ -3383,6 +3383,51 @@
           </w:p>
         </w:tc>
       </w:tr>
+      <w:tr>
+        <w:tc>
+          <w:tcPr>
+            <w:tcW w:type="dxa" w:w="5083"/>
+            <w:shd w:fill="F1F5F9"/>
+            <w:vAlign w:val="center"/>
+          </w:tcPr>
+          <w:p>
+            <w:pPr>
+              <w:spacing w:after="0"/>
+            </w:pPr>
+            <w:r/>
+            <w:r>
+              <w:rPr>
+                <w:rFonts w:ascii="Aptos" w:hAnsi="Aptos"/>
+                <w:b/>
+                <w:color w:val="1F2937"/>
+                <w:sz w:val="17"/>
+              </w:rPr>
+              <w:t>Silent demo</w:t>
+            </w:r>
+          </w:p>
+        </w:tc>
+        <w:tc>
+          <w:tcPr>
+            <w:tcW w:type="dxa" w:w="5083"/>
+            <w:vAlign w:val="center"/>
+          </w:tcPr>
+          <w:p>
+            <w:pPr>
+              <w:spacing w:after="0"/>
+            </w:pPr>
+            <w:r/>
+            <w:r>
+              <w:rPr>
+                <w:rFonts w:ascii="Aptos" w:hAnsi="Aptos"/>
+                <w:b w:val="0"/>
+                <w:color w:val="1F2937"/>
+                <w:sz w:val="17"/>
+              </w:rPr>
+              <w:t>4:00 terminal typing and guest-cursor MP4 with matching voice-over script</w:t>
+            </w:r>
+          </w:p>
+        </w:tc>
+      </w:tr>
     </w:tbl>
     <w:p>
       <w:pPr>
@@ -3440,6 +3485,23 @@
             <w:u w:val="single"/>
           </w:rPr>
           <w:t>https://github.com/Jubayed-Sahel/JAS-OS/blob/main/docs/JAS-OS-demo.mp4</w:t>
+        </w:r>
+      </w:hyperlink>
+    </w:p>
+    <w:p>
+      <w:r>
+        <w:rPr>
+          <w:b/>
+        </w:rPr>
+        <w:t xml:space="preserve">Silent terminal demonstration: </w:t>
+      </w:r>
+      <w:hyperlink r:id="rId15">
+        <w:r>
+          <w:rPr>
+            <w:color w:val="0F766E"/>
+            <w:u w:val="single"/>
+          </w:rPr>
+          <w:t>https://github.com/Jubayed-Sahel/JAS-OS/blob/main/docs/JAS-OS-Silent-Terminal-Demo.mp4</w:t>
         </w:r>
       </w:hyperlink>
     </w:p>

</xml_diff>

<commit_message>
Remove rejected silent demonstration
</commit_message>
<xml_diff>
--- a/docs/JAS-OS-Technical-Report.docx
+++ b/docs/JAS-OS-Technical-Report.docx
@@ -3383,51 +3383,6 @@
           </w:p>
         </w:tc>
       </w:tr>
-      <w:tr>
-        <w:tc>
-          <w:tcPr>
-            <w:tcW w:type="dxa" w:w="5083"/>
-            <w:shd w:fill="F1F5F9"/>
-            <w:vAlign w:val="center"/>
-          </w:tcPr>
-          <w:p>
-            <w:pPr>
-              <w:spacing w:after="0"/>
-            </w:pPr>
-            <w:r/>
-            <w:r>
-              <w:rPr>
-                <w:rFonts w:ascii="Aptos" w:hAnsi="Aptos"/>
-                <w:b/>
-                <w:color w:val="1F2937"/>
-                <w:sz w:val="17"/>
-              </w:rPr>
-              <w:t>Silent demo</w:t>
-            </w:r>
-          </w:p>
-        </w:tc>
-        <w:tc>
-          <w:tcPr>
-            <w:tcW w:type="dxa" w:w="5083"/>
-            <w:vAlign w:val="center"/>
-          </w:tcPr>
-          <w:p>
-            <w:pPr>
-              <w:spacing w:after="0"/>
-            </w:pPr>
-            <w:r/>
-            <w:r>
-              <w:rPr>
-                <w:rFonts w:ascii="Aptos" w:hAnsi="Aptos"/>
-                <w:b w:val="0"/>
-                <w:color w:val="1F2937"/>
-                <w:sz w:val="17"/>
-              </w:rPr>
-              <w:t>4:00 terminal typing and guest-cursor MP4 with matching voice-over script</w:t>
-            </w:r>
-          </w:p>
-        </w:tc>
-      </w:tr>
     </w:tbl>
     <w:p>
       <w:pPr>
@@ -3485,23 +3440,6 @@
             <w:u w:val="single"/>
           </w:rPr>
           <w:t>https://github.com/Jubayed-Sahel/JAS-OS/blob/main/docs/JAS-OS-demo.mp4</w:t>
-        </w:r>
-      </w:hyperlink>
-    </w:p>
-    <w:p>
-      <w:r>
-        <w:rPr>
-          <w:b/>
-        </w:rPr>
-        <w:t xml:space="preserve">Silent terminal demonstration: </w:t>
-      </w:r>
-      <w:hyperlink r:id="rId15">
-        <w:r>
-          <w:rPr>
-            <w:color w:val="0F766E"/>
-            <w:u w:val="single"/>
-          </w:rPr>
-          <w:t>https://github.com/Jubayed-Sahel/JAS-OS/blob/main/docs/JAS-OS-Silent-Terminal-Demo.mp4</w:t>
         </w:r>
       </w:hyperlink>
     </w:p>

</xml_diff>

<commit_message>
Improve terminal usability and concept demos
</commit_message>
<xml_diff>
--- a/docs/JAS-OS-Technical-Report.docx
+++ b/docs/JAS-OS-Technical-Report.docx
@@ -39,7 +39,7 @@
           <w:color w:val="475569"/>
           <w:sz w:val="28"/>
         </w:rPr>
-        <w:t>Implementing and proving my understanding of CSE 323 lecture concepts</w:t>
+        <w:t>Freestanding 32-bit x86 operating-system implementation</w:t>
       </w:r>
     </w:p>
     <w:p/>
@@ -257,7 +257,7 @@
                 <w:color w:val="1F2937"/>
                 <w:sz w:val="18"/>
               </w:rPr>
-              <w:t>Scope</w:t>
+              <w:t>Platform</w:t>
             </w:r>
           </w:p>
         </w:tc>
@@ -279,53 +279,7 @@
                 <w:color w:val="1F2937"/>
                 <w:sz w:val="18"/>
               </w:rPr>
-              <w:t>Main lecture concepts from Chapters 1-13; Chapter 14 onward excluded</w:t>
-            </w:r>
-          </w:p>
-        </w:tc>
-      </w:tr>
-      <w:tr>
-        <w:tc>
-          <w:tcPr>
-            <w:tcW w:type="dxa" w:w="5083"/>
-            <w:shd w:fill="0F766E"/>
-            <w:vAlign w:val="center"/>
-          </w:tcPr>
-          <w:p>
-            <w:pPr>
-              <w:spacing w:after="0"/>
-            </w:pPr>
-            <w:r/>
-            <w:r>
-              <w:rPr>
-                <w:rFonts w:ascii="Aptos" w:hAnsi="Aptos"/>
-                <w:b/>
-                <w:color w:val="FFFFFF"/>
-                <w:sz w:val="18"/>
-              </w:rPr>
-              <w:t>Project motive</w:t>
-            </w:r>
-          </w:p>
-        </w:tc>
-        <w:tc>
-          <w:tcPr>
-            <w:tcW w:type="dxa" w:w="5083"/>
-            <w:shd w:fill="E8F4F3"/>
-            <w:vAlign w:val="center"/>
-          </w:tcPr>
-          <w:p>
-            <w:pPr>
-              <w:spacing w:after="0"/>
-            </w:pPr>
-            <w:r/>
-            <w:r>
-              <w:rPr>
-                <w:rFonts w:ascii="Aptos" w:hAnsi="Aptos"/>
-                <w:b/>
-                <w:color w:val="1F2937"/>
-                <w:sz w:val="18"/>
-              </w:rPr>
-              <w:t>Implement, test, and prove my own understanding — not teach other people</w:t>
+              <w:t>Freestanding i686 kernel booted from an ISO in Oracle VirtualBox</w:t>
             </w:r>
           </w:p>
         </w:tc>
@@ -356,7 +310,7 @@
           <w:color w:val="475569"/>
           <w:sz w:val="18"/>
         </w:rPr>
-        <w:t>Report structure: objective and scope · implemented concepts · evidence · STAR challenges · verification · submission links</w:t>
+        <w:t>Report structure: system overview · implemented features · demonstrations · STAR challenges · verification · submission links</w:t>
       </w:r>
     </w:p>
     <w:p>
@@ -375,12 +329,13 @@
     <w:p>
       <w:pPr>
         <w:spacing w:after="100" w:line="259" w:lineRule="auto"/>
+        <w:ind w:left="0" w:firstLine="0"/>
       </w:pPr>
       <w:r>
         <w:rPr>
           <w:color w:val="1F2937"/>
         </w:rPr>
-        <w:t>JAS OS is a bootable, freestanding 32-bit x86 course-project operating system. Its purpose is to implement, test, and prove my own understanding of the main CSE 323 lecture concepts from Chapters 1-13. It is not intended to teach other people. Each feature connects a lecture concept to code, changing kernel state, and an observable algorithmic result.</w:t>
+        <w:t>JAS OS is a bootable, freestanding 32-bit x86 course-project operating system. It boots from an ISO in Oracle VirtualBox and provides a graphical desktop, terminal, applications, and observable kernel subsystems. Live output includes task states, scheduling activity, synchronization values, memory statistics, deadlock safety results, paging state, file-system metadata, storage calculations, and I/O counters.</w:t>
       </w:r>
     </w:p>
     <w:p>
@@ -388,23 +343,25 @@
         <w:pStyle w:val="Heading1"/>
       </w:pPr>
       <w:r>
-        <w:t>2. Project Objective and Scope</w:t>
+        <w:t>2. System Overview and Scope</w:t>
       </w:r>
     </w:p>
     <w:p>
       <w:pPr>
         <w:spacing w:after="100" w:line="259" w:lineRule="auto"/>
+        <w:ind w:left="0" w:firstLine="0"/>
       </w:pPr>
       <w:r>
         <w:rPr>
           <w:color w:val="1F2937"/>
         </w:rPr>
-        <w:t>The previous project was an ESP32-S3 mini-kernel. My objective was to transfer its useful operating-system ideas to a PC-style x86 kernel that boots from an ISO in Oracle VirtualBox. I included the main concepts through Chapter 13 and excluded Chapter 14 onward as required.</w:t>
+        <w:t>JAS OS transfers the useful operating-system components of an earlier ESP32-S3 mini-kernel to a PC-style x86 environment. The result includes a custom boot path, protected-mode kernel, graphical desktop, terminal, Files, Notes, Task Manager, Calculator, Settings, Clock, and OS Lab.</w:t>
       </w:r>
     </w:p>
     <w:p>
       <w:pPr>
         <w:spacing w:after="100" w:line="259" w:lineRule="auto"/>
+        <w:ind w:left="0" w:firstLine="0"/>
       </w:pPr>
       <w:r>
         <w:rPr>
@@ -423,6 +380,7 @@
     <w:p>
       <w:pPr>
         <w:spacing w:after="100" w:line="259" w:lineRule="auto"/>
+        <w:ind w:left="0" w:firstLine="0"/>
       </w:pPr>
       <w:r>
         <w:rPr>
@@ -435,59 +393,7 @@
         <w:rPr>
           <w:color w:val="1F2937"/>
         </w:rPr>
-        <w:t xml:space="preserve"> Chapter 14 onward, networking, ring-3 isolation, production device drivers, and claims of production persistence or security.</w:t>
-      </w:r>
-    </w:p>
-    <w:p>
-      <w:pPr>
-        <w:jc w:val="center"/>
-      </w:pPr>
-      <w:r>
-        <w:drawing>
-          <wp:inline xmlns:a="http://schemas.openxmlformats.org/drawingml/2006/main" xmlns:pic="http://schemas.openxmlformats.org/drawingml/2006/picture">
-            <wp:extent cx="6172200" cy="4629150"/>
-            <wp:docPr id="1" name="Picture 1"/>
-            <wp:cNvGraphicFramePr>
-              <a:graphicFrameLocks noChangeAspect="1"/>
-            </wp:cNvGraphicFramePr>
-            <a:graphic>
-              <a:graphicData uri="http://schemas.openxmlformats.org/drawingml/2006/picture">
-                <pic:pic>
-                  <pic:nvPicPr>
-                    <pic:cNvPr id="0" name="understanding-guide.png"/>
-                    <pic:cNvPicPr/>
-                  </pic:nvPicPr>
-                  <pic:blipFill>
-                    <a:blip r:embed="rId12"/>
-                    <a:stretch>
-                      <a:fillRect/>
-                    </a:stretch>
-                  </pic:blipFill>
-                  <pic:spPr>
-                    <a:xfrm>
-                      <a:off x="0" y="0"/>
-                      <a:ext cx="6172200" cy="4629150"/>
-                    </a:xfrm>
-                    <a:prstGeom prst="rect"/>
-                  </pic:spPr>
-                </pic:pic>
-              </a:graphicData>
-            </a:graphic>
-          </wp:inline>
-        </w:drawing>
-      </w:r>
-    </w:p>
-    <w:p>
-      <w:pPr>
-        <w:jc w:val="center"/>
-      </w:pPr>
-      <w:r>
-        <w:rPr>
-          <w:i/>
-          <w:color w:val="475569"/>
-          <w:sz w:val="17"/>
-        </w:rPr>
-        <w:t>Figure 1. JAS OS understanding guide running from the rebuilt ISO in Oracle VirtualBox.</w:t>
+        <w:t xml:space="preserve"> Networking, ring-3 isolation, production device drivers, and claims of production persistence or security.</w:t>
       </w:r>
     </w:p>
     <w:p>
@@ -506,6 +412,7 @@
     <w:p>
       <w:pPr>
         <w:spacing w:after="100" w:line="259" w:lineRule="auto"/>
+        <w:ind w:left="0" w:firstLine="0"/>
       </w:pPr>
       <w:r>
         <w:rPr>
@@ -744,7 +651,7 @@
                 <w:color w:val="1F2937"/>
                 <w:sz w:val="17"/>
               </w:rPr>
-              <w:t>Desktop, Terminal, understanding Guide, OS Lab, global STOP</w:t>
+              <w:t>Desktop, Terminal, Feature Guide, OS Lab, global STOP</w:t>
             </w:r>
           </w:p>
         </w:tc>
@@ -755,7 +662,7 @@
         <w:pStyle w:val="Heading1"/>
       </w:pPr>
       <w:r>
-        <w:t>4. Implemented Lecture Concepts</w:t>
+        <w:t>4. Implemented Features</w:t>
       </w:r>
     </w:p>
     <w:tbl>
@@ -765,14 +672,13 @@
         <w:tblLook w:firstColumn="1" w:firstRow="1" w:lastColumn="0" w:lastRow="0" w:noHBand="0" w:noVBand="1" w:val="04A0"/>
       </w:tblPr>
       <w:tblGrid>
-        <w:gridCol w:w="3389"/>
-        <w:gridCol w:w="3389"/>
-        <w:gridCol w:w="3389"/>
+        <w:gridCol w:w="5083"/>
+        <w:gridCol w:w="5083"/>
       </w:tblGrid>
       <w:tr>
         <w:tc>
           <w:tcPr>
-            <w:tcW w:type="dxa" w:w="3389"/>
+            <w:tcW w:type="dxa" w:w="5083"/>
             <w:shd w:fill="0F766E"/>
             <w:vAlign w:val="center"/>
           </w:tcPr>
@@ -788,35 +694,13 @@
                 <w:color w:val="FFFFFF"/>
                 <w:sz w:val="17"/>
               </w:rPr>
-              <w:t>Chapter</w:t>
+              <w:t>Feature</w:t>
             </w:r>
           </w:p>
         </w:tc>
         <w:tc>
           <w:tcPr>
-            <w:tcW w:type="dxa" w:w="3389"/>
-            <w:shd w:fill="0F766E"/>
-            <w:vAlign w:val="center"/>
-          </w:tcPr>
-          <w:p>
-            <w:pPr>
-              <w:spacing w:after="0"/>
-            </w:pPr>
-            <w:r/>
-            <w:r>
-              <w:rPr>
-                <w:rFonts w:ascii="Aptos" w:hAnsi="Aptos"/>
-                <w:b/>
-                <w:color w:val="FFFFFF"/>
-                <w:sz w:val="17"/>
-              </w:rPr>
-              <w:t>Lecture concept</w:t>
-            </w:r>
-          </w:p>
-        </w:tc>
-        <w:tc>
-          <w:tcPr>
-            <w:tcW w:type="dxa" w:w="3389"/>
+            <w:tcW w:type="dxa" w:w="5083"/>
             <w:shd w:fill="0F766E"/>
             <w:vAlign w:val="center"/>
           </w:tcPr>
@@ -840,7 +724,7 @@
       <w:tr>
         <w:tc>
           <w:tcPr>
-            <w:tcW w:type="dxa" w:w="3389"/>
+            <w:tcW w:type="dxa" w:w="5083"/>
             <w:shd w:fill="F1F5F9"/>
             <w:vAlign w:val="center"/>
           </w:tcPr>
@@ -856,35 +740,13 @@
                 <w:color w:val="1F2937"/>
                 <w:sz w:val="17"/>
               </w:rPr>
-              <w:t>1</w:t>
-            </w:r>
-          </w:p>
-        </w:tc>
-        <w:tc>
-          <w:tcPr>
-            <w:tcW w:type="dxa" w:w="3389"/>
-            <w:shd w:fill="F1F5F9"/>
-            <w:vAlign w:val="center"/>
-          </w:tcPr>
-          <w:p>
-            <w:pPr>
-              <w:spacing w:after="0"/>
-            </w:pPr>
-            <w:r/>
-            <w:r>
-              <w:rPr>
-                <w:rFonts w:ascii="Aptos" w:hAnsi="Aptos"/>
-                <w:b w:val="0"/>
-                <w:color w:val="1F2937"/>
-                <w:sz w:val="17"/>
-              </w:rPr>
               <w:t>OS organization</w:t>
             </w:r>
           </w:p>
         </w:tc>
         <w:tc>
           <w:tcPr>
-            <w:tcW w:type="dxa" w:w="3389"/>
+            <w:tcW w:type="dxa" w:w="5083"/>
             <w:shd w:fill="F1F5F9"/>
             <w:vAlign w:val="center"/>
           </w:tcPr>
@@ -908,7 +770,7 @@
       <w:tr>
         <w:tc>
           <w:tcPr>
-            <w:tcW w:type="dxa" w:w="3389"/>
+            <w:tcW w:type="dxa" w:w="5083"/>
             <w:shd w:fill="FFFFFF"/>
             <w:vAlign w:val="center"/>
           </w:tcPr>
@@ -924,35 +786,13 @@
                 <w:color w:val="1F2937"/>
                 <w:sz w:val="17"/>
               </w:rPr>
-              <w:t>2</w:t>
-            </w:r>
-          </w:p>
-        </w:tc>
-        <w:tc>
-          <w:tcPr>
-            <w:tcW w:type="dxa" w:w="3389"/>
-            <w:shd w:fill="FFFFFF"/>
-            <w:vAlign w:val="center"/>
-          </w:tcPr>
-          <w:p>
-            <w:pPr>
-              <w:spacing w:after="0"/>
-            </w:pPr>
-            <w:r/>
-            <w:r>
-              <w:rPr>
-                <w:rFonts w:ascii="Aptos" w:hAnsi="Aptos"/>
-                <w:b w:val="0"/>
-                <w:color w:val="1F2937"/>
-                <w:sz w:val="17"/>
-              </w:rPr>
               <w:t>Services and boot</w:t>
             </w:r>
           </w:p>
         </w:tc>
         <w:tc>
           <w:tcPr>
-            <w:tcW w:type="dxa" w:w="3389"/>
+            <w:tcW w:type="dxa" w:w="5083"/>
             <w:shd w:fill="FFFFFF"/>
             <w:vAlign w:val="center"/>
           </w:tcPr>
@@ -976,7 +816,7 @@
       <w:tr>
         <w:tc>
           <w:tcPr>
-            <w:tcW w:type="dxa" w:w="3389"/>
+            <w:tcW w:type="dxa" w:w="5083"/>
             <w:shd w:fill="F1F5F9"/>
             <w:vAlign w:val="center"/>
           </w:tcPr>
@@ -992,35 +832,13 @@
                 <w:color w:val="1F2937"/>
                 <w:sz w:val="17"/>
               </w:rPr>
-              <w:t>3</w:t>
-            </w:r>
-          </w:p>
-        </w:tc>
-        <w:tc>
-          <w:tcPr>
-            <w:tcW w:type="dxa" w:w="3389"/>
-            <w:shd w:fill="F1F5F9"/>
-            <w:vAlign w:val="center"/>
-          </w:tcPr>
-          <w:p>
-            <w:pPr>
-              <w:spacing w:after="0"/>
-            </w:pPr>
-            <w:r/>
-            <w:r>
-              <w:rPr>
-                <w:rFonts w:ascii="Aptos" w:hAnsi="Aptos"/>
-                <w:b w:val="0"/>
-                <w:color w:val="1F2937"/>
-                <w:sz w:val="17"/>
-              </w:rPr>
               <w:t>Processes and IPC</w:t>
             </w:r>
           </w:p>
         </w:tc>
         <w:tc>
           <w:tcPr>
-            <w:tcW w:type="dxa" w:w="3389"/>
+            <w:tcW w:type="dxa" w:w="5083"/>
             <w:shd w:fill="F1F5F9"/>
             <w:vAlign w:val="center"/>
           </w:tcPr>
@@ -1044,7 +862,7 @@
       <w:tr>
         <w:tc>
           <w:tcPr>
-            <w:tcW w:type="dxa" w:w="3389"/>
+            <w:tcW w:type="dxa" w:w="5083"/>
             <w:shd w:fill="FFFFFF"/>
             <w:vAlign w:val="center"/>
           </w:tcPr>
@@ -1060,35 +878,13 @@
                 <w:color w:val="1F2937"/>
                 <w:sz w:val="17"/>
               </w:rPr>
-              <w:t>4</w:t>
-            </w:r>
-          </w:p>
-        </w:tc>
-        <w:tc>
-          <w:tcPr>
-            <w:tcW w:type="dxa" w:w="3389"/>
-            <w:shd w:fill="FFFFFF"/>
-            <w:vAlign w:val="center"/>
-          </w:tcPr>
-          <w:p>
-            <w:pPr>
-              <w:spacing w:after="0"/>
-            </w:pPr>
-            <w:r/>
-            <w:r>
-              <w:rPr>
-                <w:rFonts w:ascii="Aptos" w:hAnsi="Aptos"/>
-                <w:b w:val="0"/>
-                <w:color w:val="1F2937"/>
-                <w:sz w:val="17"/>
-              </w:rPr>
               <w:t>Threads</w:t>
             </w:r>
           </w:p>
         </w:tc>
         <w:tc>
           <w:tcPr>
-            <w:tcW w:type="dxa" w:w="3389"/>
+            <w:tcW w:type="dxa" w:w="5083"/>
             <w:shd w:fill="FFFFFF"/>
             <w:vAlign w:val="center"/>
           </w:tcPr>
@@ -1112,7 +908,7 @@
       <w:tr>
         <w:tc>
           <w:tcPr>
-            <w:tcW w:type="dxa" w:w="3389"/>
+            <w:tcW w:type="dxa" w:w="5083"/>
             <w:shd w:fill="F1F5F9"/>
             <w:vAlign w:val="center"/>
           </w:tcPr>
@@ -1128,35 +924,13 @@
                 <w:color w:val="1F2937"/>
                 <w:sz w:val="17"/>
               </w:rPr>
-              <w:t>5</w:t>
-            </w:r>
-          </w:p>
-        </w:tc>
-        <w:tc>
-          <w:tcPr>
-            <w:tcW w:type="dxa" w:w="3389"/>
-            <w:shd w:fill="F1F5F9"/>
-            <w:vAlign w:val="center"/>
-          </w:tcPr>
-          <w:p>
-            <w:pPr>
-              <w:spacing w:after="0"/>
-            </w:pPr>
-            <w:r/>
-            <w:r>
-              <w:rPr>
-                <w:rFonts w:ascii="Aptos" w:hAnsi="Aptos"/>
-                <w:b w:val="0"/>
-                <w:color w:val="1F2937"/>
-                <w:sz w:val="17"/>
-              </w:rPr>
               <w:t>CPU scheduling</w:t>
             </w:r>
           </w:p>
         </w:tc>
         <w:tc>
           <w:tcPr>
-            <w:tcW w:type="dxa" w:w="3389"/>
+            <w:tcW w:type="dxa" w:w="5083"/>
             <w:shd w:fill="F1F5F9"/>
             <w:vAlign w:val="center"/>
           </w:tcPr>
@@ -1180,7 +954,7 @@
       <w:tr>
         <w:tc>
           <w:tcPr>
-            <w:tcW w:type="dxa" w:w="3389"/>
+            <w:tcW w:type="dxa" w:w="5083"/>
             <w:shd w:fill="FFFFFF"/>
             <w:vAlign w:val="center"/>
           </w:tcPr>
@@ -1196,35 +970,13 @@
                 <w:color w:val="1F2937"/>
                 <w:sz w:val="17"/>
               </w:rPr>
-              <w:t>6</w:t>
-            </w:r>
-          </w:p>
-        </w:tc>
-        <w:tc>
-          <w:tcPr>
-            <w:tcW w:type="dxa" w:w="3389"/>
-            <w:shd w:fill="FFFFFF"/>
-            <w:vAlign w:val="center"/>
-          </w:tcPr>
-          <w:p>
-            <w:pPr>
-              <w:spacing w:after="0"/>
-            </w:pPr>
-            <w:r/>
-            <w:r>
-              <w:rPr>
-                <w:rFonts w:ascii="Aptos" w:hAnsi="Aptos"/>
-                <w:b w:val="0"/>
-                <w:color w:val="1F2937"/>
-                <w:sz w:val="17"/>
-              </w:rPr>
               <w:t>Synchronization</w:t>
             </w:r>
           </w:p>
         </w:tc>
         <w:tc>
           <w:tcPr>
-            <w:tcW w:type="dxa" w:w="3389"/>
+            <w:tcW w:type="dxa" w:w="5083"/>
             <w:shd w:fill="FFFFFF"/>
             <w:vAlign w:val="center"/>
           </w:tcPr>
@@ -1248,7 +1000,7 @@
       <w:tr>
         <w:tc>
           <w:tcPr>
-            <w:tcW w:type="dxa" w:w="3389"/>
+            <w:tcW w:type="dxa" w:w="5083"/>
             <w:shd w:fill="F1F5F9"/>
             <w:vAlign w:val="center"/>
           </w:tcPr>
@@ -1264,35 +1016,13 @@
                 <w:color w:val="1F2937"/>
                 <w:sz w:val="17"/>
               </w:rPr>
-              <w:t>7</w:t>
+              <w:t>Deadlock avoidance</w:t>
             </w:r>
           </w:p>
         </w:tc>
         <w:tc>
           <w:tcPr>
-            <w:tcW w:type="dxa" w:w="3389"/>
-            <w:shd w:fill="F1F5F9"/>
-            <w:vAlign w:val="center"/>
-          </w:tcPr>
-          <w:p>
-            <w:pPr>
-              <w:spacing w:after="0"/>
-            </w:pPr>
-            <w:r/>
-            <w:r>
-              <w:rPr>
-                <w:rFonts w:ascii="Aptos" w:hAnsi="Aptos"/>
-                <w:b w:val="0"/>
-                <w:color w:val="1F2937"/>
-                <w:sz w:val="17"/>
-              </w:rPr>
-              <w:t>Deadlocks</w:t>
-            </w:r>
-          </w:p>
-        </w:tc>
-        <w:tc>
-          <w:tcPr>
-            <w:tcW w:type="dxa" w:w="3389"/>
+            <w:tcW w:type="dxa" w:w="5083"/>
             <w:shd w:fill="F1F5F9"/>
             <w:vAlign w:val="center"/>
           </w:tcPr>
@@ -1316,7 +1046,7 @@
       <w:tr>
         <w:tc>
           <w:tcPr>
-            <w:tcW w:type="dxa" w:w="3389"/>
+            <w:tcW w:type="dxa" w:w="5083"/>
             <w:shd w:fill="FFFFFF"/>
             <w:vAlign w:val="center"/>
           </w:tcPr>
@@ -1332,35 +1062,13 @@
                 <w:color w:val="1F2937"/>
                 <w:sz w:val="17"/>
               </w:rPr>
-              <w:t>8</w:t>
-            </w:r>
-          </w:p>
-        </w:tc>
-        <w:tc>
-          <w:tcPr>
-            <w:tcW w:type="dxa" w:w="3389"/>
-            <w:shd w:fill="FFFFFF"/>
-            <w:vAlign w:val="center"/>
-          </w:tcPr>
-          <w:p>
-            <w:pPr>
-              <w:spacing w:after="0"/>
-            </w:pPr>
-            <w:r/>
-            <w:r>
-              <w:rPr>
-                <w:rFonts w:ascii="Aptos" w:hAnsi="Aptos"/>
-                <w:b w:val="0"/>
-                <w:color w:val="1F2937"/>
-                <w:sz w:val="17"/>
-              </w:rPr>
               <w:t>Main memory</w:t>
             </w:r>
           </w:p>
         </w:tc>
         <w:tc>
           <w:tcPr>
-            <w:tcW w:type="dxa" w:w="3389"/>
+            <w:tcW w:type="dxa" w:w="5083"/>
             <w:shd w:fill="FFFFFF"/>
             <w:vAlign w:val="center"/>
           </w:tcPr>
@@ -1384,7 +1092,7 @@
       <w:tr>
         <w:tc>
           <w:tcPr>
-            <w:tcW w:type="dxa" w:w="3389"/>
+            <w:tcW w:type="dxa" w:w="5083"/>
             <w:shd w:fill="F1F5F9"/>
             <w:vAlign w:val="center"/>
           </w:tcPr>
@@ -1400,35 +1108,13 @@
                 <w:color w:val="1F2937"/>
                 <w:sz w:val="17"/>
               </w:rPr>
-              <w:t>9</w:t>
-            </w:r>
-          </w:p>
-        </w:tc>
-        <w:tc>
-          <w:tcPr>
-            <w:tcW w:type="dxa" w:w="3389"/>
-            <w:shd w:fill="F1F5F9"/>
-            <w:vAlign w:val="center"/>
-          </w:tcPr>
-          <w:p>
-            <w:pPr>
-              <w:spacing w:after="0"/>
-            </w:pPr>
-            <w:r/>
-            <w:r>
-              <w:rPr>
-                <w:rFonts w:ascii="Aptos" w:hAnsi="Aptos"/>
-                <w:b w:val="0"/>
-                <w:color w:val="1F2937"/>
-                <w:sz w:val="17"/>
-              </w:rPr>
               <w:t>Virtual memory</w:t>
             </w:r>
           </w:p>
         </w:tc>
         <w:tc>
           <w:tcPr>
-            <w:tcW w:type="dxa" w:w="3389"/>
+            <w:tcW w:type="dxa" w:w="5083"/>
             <w:shd w:fill="F1F5F9"/>
             <w:vAlign w:val="center"/>
           </w:tcPr>
@@ -1452,7 +1138,7 @@
       <w:tr>
         <w:tc>
           <w:tcPr>
-            <w:tcW w:type="dxa" w:w="3389"/>
+            <w:tcW w:type="dxa" w:w="5083"/>
             <w:shd w:fill="FFFFFF"/>
             <w:vAlign w:val="center"/>
           </w:tcPr>
@@ -1468,13 +1154,13 @@
                 <w:color w:val="1F2937"/>
                 <w:sz w:val="17"/>
               </w:rPr>
-              <w:t>10</w:t>
+              <w:t>File system</w:t>
             </w:r>
           </w:p>
         </w:tc>
         <w:tc>
           <w:tcPr>
-            <w:tcW w:type="dxa" w:w="3389"/>
+            <w:tcW w:type="dxa" w:w="5083"/>
             <w:shd w:fill="FFFFFF"/>
             <w:vAlign w:val="center"/>
           </w:tcPr>
@@ -1490,13 +1176,83 @@
                 <w:color w:val="1F2937"/>
                 <w:sz w:val="17"/>
               </w:rPr>
-              <w:t>File-system interface</w:t>
+              <w:t>MiniFS directories, files, and allocation comparison</w:t>
+            </w:r>
+          </w:p>
+        </w:tc>
+      </w:tr>
+      <w:tr>
+        <w:tc>
+          <w:tcPr>
+            <w:tcW w:type="dxa" w:w="5083"/>
+            <w:shd w:fill="F1F5F9"/>
+            <w:vAlign w:val="center"/>
+          </w:tcPr>
+          <w:p>
+            <w:pPr>
+              <w:spacing w:after="0"/>
+            </w:pPr>
+            <w:r/>
+            <w:r>
+              <w:rPr>
+                <w:rFonts w:ascii="Aptos" w:hAnsi="Aptos"/>
+                <w:b/>
+                <w:color w:val="1F2937"/>
+                <w:sz w:val="17"/>
+              </w:rPr>
+              <w:t>Mass storage</w:t>
             </w:r>
           </w:p>
         </w:tc>
         <w:tc>
           <w:tcPr>
-            <w:tcW w:type="dxa" w:w="3389"/>
+            <w:tcW w:type="dxa" w:w="5083"/>
+            <w:shd w:fill="F1F5F9"/>
+            <w:vAlign w:val="center"/>
+          </w:tcPr>
+          <w:p>
+            <w:pPr>
+              <w:spacing w:after="0"/>
+            </w:pPr>
+            <w:r/>
+            <w:r>
+              <w:rPr>
+                <w:rFonts w:ascii="Aptos" w:hAnsi="Aptos"/>
+                <w:b w:val="0"/>
+                <w:color w:val="1F2937"/>
+                <w:sz w:val="17"/>
+              </w:rPr>
+              <w:t>Disk algorithms and RAID model</w:t>
+            </w:r>
+          </w:p>
+        </w:tc>
+      </w:tr>
+      <w:tr>
+        <w:tc>
+          <w:tcPr>
+            <w:tcW w:type="dxa" w:w="5083"/>
+            <w:shd w:fill="FFFFFF"/>
+            <w:vAlign w:val="center"/>
+          </w:tcPr>
+          <w:p>
+            <w:pPr>
+              <w:spacing w:after="0"/>
+            </w:pPr>
+            <w:r/>
+            <w:r>
+              <w:rPr>
+                <w:rFonts w:ascii="Aptos" w:hAnsi="Aptos"/>
+                <w:b/>
+                <w:color w:val="1F2937"/>
+                <w:sz w:val="17"/>
+              </w:rPr>
+              <w:t>I/O systems</w:t>
+            </w:r>
+          </w:p>
+        </w:tc>
+        <w:tc>
+          <w:tcPr>
+            <w:tcW w:type="dxa" w:w="5083"/>
             <w:shd w:fill="FFFFFF"/>
             <w:vAlign w:val="center"/>
           </w:tcPr>
@@ -1512,211 +1268,7 @@
                 <w:color w:val="1F2937"/>
                 <w:sz w:val="17"/>
               </w:rPr>
-              <w:t>MiniFS directories and files</w:t>
-            </w:r>
-          </w:p>
-        </w:tc>
-      </w:tr>
-      <w:tr>
-        <w:tc>
-          <w:tcPr>
-            <w:tcW w:type="dxa" w:w="3389"/>
-            <w:shd w:fill="F1F5F9"/>
-            <w:vAlign w:val="center"/>
-          </w:tcPr>
-          <w:p>
-            <w:pPr>
-              <w:spacing w:after="0"/>
-            </w:pPr>
-            <w:r/>
-            <w:r>
-              <w:rPr>
-                <w:rFonts w:ascii="Aptos" w:hAnsi="Aptos"/>
-                <w:b/>
-                <w:color w:val="1F2937"/>
-                <w:sz w:val="17"/>
-              </w:rPr>
-              <w:t>11</w:t>
-            </w:r>
-          </w:p>
-        </w:tc>
-        <w:tc>
-          <w:tcPr>
-            <w:tcW w:type="dxa" w:w="3389"/>
-            <w:shd w:fill="F1F5F9"/>
-            <w:vAlign w:val="center"/>
-          </w:tcPr>
-          <w:p>
-            <w:pPr>
-              <w:spacing w:after="0"/>
-            </w:pPr>
-            <w:r/>
-            <w:r>
-              <w:rPr>
-                <w:rFonts w:ascii="Aptos" w:hAnsi="Aptos"/>
-                <w:b w:val="0"/>
-                <w:color w:val="1F2937"/>
-                <w:sz w:val="17"/>
-              </w:rPr>
-              <w:t>File-system implementation</w:t>
-            </w:r>
-          </w:p>
-        </w:tc>
-        <w:tc>
-          <w:tcPr>
-            <w:tcW w:type="dxa" w:w="3389"/>
-            <w:shd w:fill="F1F5F9"/>
-            <w:vAlign w:val="center"/>
-          </w:tcPr>
-          <w:p>
-            <w:pPr>
-              <w:spacing w:after="0"/>
-            </w:pPr>
-            <w:r/>
-            <w:r>
-              <w:rPr>
-                <w:rFonts w:ascii="Aptos" w:hAnsi="Aptos"/>
-                <w:b w:val="0"/>
-                <w:color w:val="1F2937"/>
-                <w:sz w:val="17"/>
-              </w:rPr>
-              <w:t>Allocation-method comparison</w:t>
-            </w:r>
-          </w:p>
-        </w:tc>
-      </w:tr>
-      <w:tr>
-        <w:tc>
-          <w:tcPr>
-            <w:tcW w:type="dxa" w:w="3389"/>
-            <w:shd w:fill="FFFFFF"/>
-            <w:vAlign w:val="center"/>
-          </w:tcPr>
-          <w:p>
-            <w:pPr>
-              <w:spacing w:after="0"/>
-            </w:pPr>
-            <w:r/>
-            <w:r>
-              <w:rPr>
-                <w:rFonts w:ascii="Aptos" w:hAnsi="Aptos"/>
-                <w:b/>
-                <w:color w:val="1F2937"/>
-                <w:sz w:val="17"/>
-              </w:rPr>
-              <w:t>12</w:t>
-            </w:r>
-          </w:p>
-        </w:tc>
-        <w:tc>
-          <w:tcPr>
-            <w:tcW w:type="dxa" w:w="3389"/>
-            <w:shd w:fill="FFFFFF"/>
-            <w:vAlign w:val="center"/>
-          </w:tcPr>
-          <w:p>
-            <w:pPr>
-              <w:spacing w:after="0"/>
-            </w:pPr>
-            <w:r/>
-            <w:r>
-              <w:rPr>
-                <w:rFonts w:ascii="Aptos" w:hAnsi="Aptos"/>
-                <w:b w:val="0"/>
-                <w:color w:val="1F2937"/>
-                <w:sz w:val="17"/>
-              </w:rPr>
-              <w:t>Mass storage</w:t>
-            </w:r>
-          </w:p>
-        </w:tc>
-        <w:tc>
-          <w:tcPr>
-            <w:tcW w:type="dxa" w:w="3389"/>
-            <w:shd w:fill="FFFFFF"/>
-            <w:vAlign w:val="center"/>
-          </w:tcPr>
-          <w:p>
-            <w:pPr>
-              <w:spacing w:after="0"/>
-            </w:pPr>
-            <w:r/>
-            <w:r>
-              <w:rPr>
-                <w:rFonts w:ascii="Aptos" w:hAnsi="Aptos"/>
-                <w:b w:val="0"/>
-                <w:color w:val="1F2937"/>
-                <w:sz w:val="17"/>
-              </w:rPr>
-              <w:t>Five disk algorithms and RAID model</w:t>
-            </w:r>
-          </w:p>
-        </w:tc>
-      </w:tr>
-      <w:tr>
-        <w:tc>
-          <w:tcPr>
-            <w:tcW w:type="dxa" w:w="3389"/>
-            <w:shd w:fill="F1F5F9"/>
-            <w:vAlign w:val="center"/>
-          </w:tcPr>
-          <w:p>
-            <w:pPr>
-              <w:spacing w:after="0"/>
-            </w:pPr>
-            <w:r/>
-            <w:r>
-              <w:rPr>
-                <w:rFonts w:ascii="Aptos" w:hAnsi="Aptos"/>
-                <w:b/>
-                <w:color w:val="1F2937"/>
-                <w:sz w:val="17"/>
-              </w:rPr>
-              <w:t>13</w:t>
-            </w:r>
-          </w:p>
-        </w:tc>
-        <w:tc>
-          <w:tcPr>
-            <w:tcW w:type="dxa" w:w="3389"/>
-            <w:shd w:fill="F1F5F9"/>
-            <w:vAlign w:val="center"/>
-          </w:tcPr>
-          <w:p>
-            <w:pPr>
-              <w:spacing w:after="0"/>
-            </w:pPr>
-            <w:r/>
-            <w:r>
-              <w:rPr>
-                <w:rFonts w:ascii="Aptos" w:hAnsi="Aptos"/>
-                <w:b w:val="0"/>
-                <w:color w:val="1F2937"/>
-                <w:sz w:val="17"/>
-              </w:rPr>
-              <w:t>I/O systems</w:t>
-            </w:r>
-          </w:p>
-        </w:tc>
-        <w:tc>
-          <w:tcPr>
-            <w:tcW w:type="dxa" w:w="3389"/>
-            <w:shd w:fill="F1F5F9"/>
-            <w:vAlign w:val="center"/>
-          </w:tcPr>
-          <w:p>
-            <w:pPr>
-              <w:spacing w:after="0"/>
-            </w:pPr>
-            <w:r/>
-            <w:r>
-              <w:rPr>
-                <w:rFonts w:ascii="Aptos" w:hAnsi="Aptos"/>
-                <w:b w:val="0"/>
-                <w:color w:val="1F2937"/>
-                <w:sz w:val="17"/>
-              </w:rPr>
-              <w:t>Polling, interrupts, DMA counters</w:t>
+              <w:t>Polling, interrupts, and DMA counters</w:t>
             </w:r>
           </w:p>
         </w:tc>
@@ -1732,18 +1284,19 @@
         <w:pStyle w:val="Heading1"/>
       </w:pPr>
       <w:r>
-        <w:t>5. Evidence of My Understanding</w:t>
+        <w:t>5. Demonstration Interface</w:t>
       </w:r>
     </w:p>
     <w:p>
       <w:pPr>
         <w:spacing w:after="100" w:line="259" w:lineRule="auto"/>
+        <w:ind w:left="0" w:firstLine="0"/>
       </w:pPr>
       <w:r>
         <w:rPr>
           <w:color w:val="1F2937"/>
         </w:rPr>
-        <w:t>The explain CH command states the concept and identifies my implementation. The present CH command then runs that implementation and prints live evidence. Scheduling changes the CPU timeline; readers-writers changes semaphore-protected state; Banker's algorithm calculates a safe sequence; and paging changes frame ownership and fault counts. OS Lab calls the same evidence path with buttons. The global stop ends all non-shell activity while keeping the terminal usable.</w:t>
+        <w:t>The terminal Feature Guide and Modules screen map each subsystem to direct commands. Scheduling changes the CPU timeline; readers-writers changes semaphore-protected state; Banker's algorithm calculates a safe sequence; and paging changes frame ownership and fault counts. OS Lab invokes the same kernel commands through buttons. The global stop ends all non-shell activity while keeping the terminal usable.</w:t>
       </w:r>
     </w:p>
     <w:p>
@@ -2067,7 +1620,7 @@
         <w:pStyle w:val="Heading2"/>
       </w:pPr>
       <w:r>
-        <w:t>Challenge 2 — Proving Understanding Instead of Printing Labels</w:t>
+        <w:t>Challenge 2 — Producing Live Evidence Instead of Static Labels</w:t>
       </w:r>
     </w:p>
     <w:tbl>
@@ -2134,7 +1687,7 @@
                 <w:color w:val="1F2937"/>
                 <w:sz w:val="18"/>
               </w:rPr>
-              <w:t>Printing algorithm names would not demonstrate that I understand how the concepts operate or affect system state.</w:t>
+              <w:t>Static interface labels would not show whether the algorithms were connected to changing system state.</w:t>
             </w:r>
           </w:p>
         </w:tc>
@@ -2209,7 +1762,7 @@
                 <w:color w:val="1F2937"/>
                 <w:sz w:val="18"/>
               </w:rPr>
-              <w:t>Connect every included chapter to stateful code and observable results.</w:t>
+              <w:t>Connect every major subsystem to stateful code and observable results.</w:t>
             </w:r>
           </w:p>
         </w:tc>
@@ -2359,7 +1912,7 @@
                 <w:color w:val="1F2937"/>
                 <w:sz w:val="18"/>
               </w:rPr>
-              <w:t>Chapters 1-13 each have a command and OS Lab button backed by live kernel state, allowing me to explain what changed and why.</w:t>
+              <w:t>Each feature has a terminal command and OS Lab button backed by live kernel state, making state changes and algorithm results directly observable.</w:t>
             </w:r>
           </w:p>
         </w:tc>
@@ -2605,7 +2158,7 @@
                 <w:color w:val="1F2937"/>
                 <w:sz w:val="18"/>
               </w:rPr>
-              <w:t>I added the understanding Guide, explain CH, present CH, chapter map, readable terminal layout, scrolling controls, and OS Lab shortcuts. Each path names the concept, my implementation, and its live proof.</w:t>
+              <w:t>I added the Feature Guide, Modules screen, readable terminal layout, scrolling controls, and OS Lab shortcuts. Each path opens a direct command for a specific kernel subsystem.</w:t>
             </w:r>
           </w:p>
         </w:tc>
@@ -2680,7 +2233,7 @@
                 <w:color w:val="1F2937"/>
                 <w:sz w:val="18"/>
               </w:rPr>
-              <w:t>I can follow a consistent assessment route and connect each lecture concept to the corresponding source-backed result.</w:t>
+              <w:t>The interface now provides a consistent route from a feature name to its source-backed live result.</w:t>
             </w:r>
           </w:p>
         </w:tc>
@@ -3108,7 +2661,7 @@
                 <w:color w:val="1F2937"/>
                 <w:sz w:val="17"/>
               </w:rPr>
-              <w:t>93,408 bytes; build completed with no compiler warnings</w:t>
+              <w:t>89,280 bytes; build completed with no compiler warnings</w:t>
             </w:r>
           </w:p>
         </w:tc>
@@ -3198,7 +2751,7 @@
                 <w:color w:val="1F2937"/>
                 <w:sz w:val="17"/>
               </w:rPr>
-              <w:t>CC89E64B14337AFAE5DAEE51B2C7A059C92BE3D808551495B41C981EAF17A2C1</w:t>
+              <w:t>87AC4F6F57DE50F15DEECB5AE510F4508AA9597E98443D40B7AB85FBBAF271AE</w:t>
             </w:r>
           </w:p>
         </w:tc>
@@ -3267,7 +2820,7 @@
                 <w:color w:val="1F2937"/>
                 <w:sz w:val="17"/>
               </w:rPr>
-              <w:t>Lecture scope</w:t>
+              <w:t>Feature coverage</w:t>
             </w:r>
           </w:p>
         </w:tc>
@@ -3288,7 +2841,7 @@
                 <w:color w:val="1F2937"/>
                 <w:sz w:val="17"/>
               </w:rPr>
-              <w:t>Main concepts from Chapters 1-13; Chapter 14 onward excluded</w:t>
+              <w:t>Scheduling, synchronization, memory, paging, files, storage, and I/O</w:t>
             </w:r>
           </w:p>
         </w:tc>
@@ -3416,7 +2969,7 @@
         </w:rPr>
         <w:t xml:space="preserve">Bootable ISO: </w:t>
       </w:r>
-      <w:hyperlink r:id="rId13">
+      <w:hyperlink r:id="rId12">
         <w:r>
           <w:rPr>
             <w:color w:val="0F766E"/>
@@ -3433,7 +2986,7 @@
         </w:rPr>
         <w:t xml:space="preserve">Narrated demonstration: </w:t>
       </w:r>
-      <w:hyperlink r:id="rId14">
+      <w:hyperlink r:id="rId13">
         <w:r>
           <w:rPr>
             <w:color w:val="0F766E"/>
@@ -3454,12 +3007,13 @@
     <w:p>
       <w:pPr>
         <w:spacing w:after="100" w:line="259" w:lineRule="auto"/>
+        <w:ind w:left="0" w:firstLine="0"/>
       </w:pPr>
       <w:r>
         <w:rPr>
           <w:color w:val="1F2937"/>
         </w:rPr>
-        <w:t>JAS OS is a course-project kernel, not a production operating system. Tasks are cooperative, applications execute in kernel space, and MiniFS is RAM-backed. Paging, disk, RAID, and I/O are transparent models used to test my understanding. The project does not claim ring-3 isolation, production device drivers, networking, persistence, or Chapter 14+ protection and security.</w:t>
+        <w:t>JAS OS is a course-project kernel, not a production operating system. Tasks are cooperative, applications execute in kernel space, and MiniFS is RAM-backed. Paging, disk, RAID, and I/O are transparent software models. The project does not claim ring-3 isolation, production device drivers, networking, persistence, or production security.</w:t>
       </w:r>
     </w:p>
     <w:p>
@@ -3473,12 +3027,13 @@
     <w:p>
       <w:pPr>
         <w:spacing w:after="100" w:line="259" w:lineRule="auto"/>
+        <w:ind w:left="0" w:firstLine="0"/>
       </w:pPr>
       <w:r>
         <w:rPr>
           <w:color w:val="1F2937"/>
         </w:rPr>
-        <w:t>The completed JAS OS package demonstrates that I can connect the main CSE 323 lecture concepts to a bootable implementation, inspect their state, explain the algorithms, and verify their results. The project motive is evidence of my own understanding, and the OS, report, repository, and narrated demonstration now state that consistently.</w:t>
+        <w:t>The completed JAS OS package combines a bootable x86 kernel, graphical applications, direct terminal commands, live subsystem state, a reproducible build, and a verified VirtualBox ISO. The report, repository, and demonstration materials describe the implemented features consistently.</w:t>
       </w:r>
     </w:p>
     <w:sectPr>

</xml_diff>